<commit_message>
Publish v1.0.2 public artifact release with fixed release citation
</commit_message>
<xml_diff>
--- a/docs/evidence/review-packets/emse-submission-v1/emse-title-page-draft-v1.docx
+++ b/docs/evidence/review-packets/emse-submission-v1/emse-title-page-draft-v1.docx
@@ -255,7 +255,7 @@
         <w:rPr>
           <w:rFonts w:ascii="Consolas" w:hAnsi="Consolas"/>
         </w:rPr>
-        <w:t>v1.0.1</w:t>
+        <w:t>v1.0.2</w:t>
       </w:r>
       <w:r>
         <w:t xml:space="preserve">: </w:t>
@@ -264,7 +264,7 @@
         <w:rPr>
           <w:rFonts w:ascii="Consolas" w:hAnsi="Consolas"/>
         </w:rPr>
-        <w:t>https://github.com/dfredriksen/quantyra-teaching-artifacts/releases/tag/v1.0.1</w:t>
+        <w:t>https://github.com/dfredriksen/quantyra-teaching-artifacts/releases/tag/v1.0.2</w:t>
       </w:r>
       <w:r>
         <w:t>.</w:t>

</xml_diff>